<commit_message>
Diagrama subido a memoria
</commit_message>
<xml_diff>
--- a/memorias/Bases de Datos.docx
+++ b/memorias/Bases de Datos.docx
@@ -86,50 +86,120 @@
       <w:r>
         <w:t>PostgreSQL ofrece además un excelente soporte para aplicaciones empresariales y una gran compatibilidad con aplicaciones Java mediante JDBC.</w:t>
       </w:r>
-    </w:p>
-    <w:p>
-      <w:pPr>
+      <w:r>
+        <w:t xml:space="preserve"> </w:t>
+      </w:r>
+    </w:p>
+    <w:p/>
+    <w:p>
+      <w:r>
+        <w:br w:type="page"/>
+      </w:r>
+    </w:p>
+    <w:p>
+      <w:r>
         <w:rPr>
           <w:b/>
           <w:bCs/>
           <w:sz w:val="28"/>
           <w:szCs w:val="28"/>
         </w:rPr>
-      </w:pPr>
-      <w:r>
+        <w:lastRenderedPageBreak/>
+        <w:t>Modelo Entidad–Relación (ER)</w:t>
+      </w:r>
+    </w:p>
+    <w:p>
+      <w:pPr>
+        <w:rPr>
+          <w:b/>
+          <w:bCs/>
+        </w:rPr>
+      </w:pPr>
+      <w:r>
+        <w:rPr>
+          <w:b/>
+          <w:bCs/>
+          <w:noProof/>
+        </w:rPr>
+        <w:drawing>
+          <wp:inline distT="0" distB="0" distL="0" distR="0" wp14:anchorId="06AB517B" wp14:editId="47934598">
+            <wp:extent cx="5400040" cy="7285990"/>
+            <wp:effectExtent l="0" t="0" r="0" b="0"/>
+            <wp:docPr id="1451447957" name="Picture 2"/>
+            <wp:cNvGraphicFramePr>
+              <a:graphicFrameLocks xmlns:a="http://schemas.openxmlformats.org/drawingml/2006/main" noChangeAspect="1"/>
+            </wp:cNvGraphicFramePr>
+            <a:graphic xmlns:a="http://schemas.openxmlformats.org/drawingml/2006/main">
+              <a:graphicData uri="http://schemas.openxmlformats.org/drawingml/2006/picture">
+                <pic:pic xmlns:pic="http://schemas.openxmlformats.org/drawingml/2006/picture">
+                  <pic:nvPicPr>
+                    <pic:cNvPr id="1451447957" name="Picture 1451447957"/>
+                    <pic:cNvPicPr/>
+                  </pic:nvPicPr>
+                  <pic:blipFill>
+                    <a:blip r:embed="rId8" cstate="print">
+                      <a:extLst>
+                        <a:ext uri="{28A0092B-C50C-407E-A947-70E740481C1C}">
+                          <a14:useLocalDpi xmlns:a14="http://schemas.microsoft.com/office/drawing/2010/main" val="0"/>
+                        </a:ext>
+                      </a:extLst>
+                    </a:blip>
+                    <a:stretch>
+                      <a:fillRect/>
+                    </a:stretch>
+                  </pic:blipFill>
+                  <pic:spPr>
+                    <a:xfrm>
+                      <a:off x="0" y="0"/>
+                      <a:ext cx="5400040" cy="7285990"/>
+                    </a:xfrm>
+                    <a:prstGeom prst="rect">
+                      <a:avLst/>
+                    </a:prstGeom>
+                  </pic:spPr>
+                </pic:pic>
+              </a:graphicData>
+            </a:graphic>
+          </wp:inline>
+        </w:drawing>
+      </w:r>
+    </w:p>
+    <w:p>
+      <w:pPr>
         <w:rPr>
           <w:b/>
           <w:bCs/>
           <w:sz w:val="28"/>
           <w:szCs w:val="28"/>
         </w:rPr>
-        <w:t>Modelo Entidad–Relación (ER)</w:t>
-      </w:r>
-    </w:p>
-    <w:p>
-      <w:pPr>
-        <w:rPr>
-          <w:b/>
-          <w:bCs/>
-        </w:rPr>
-      </w:pPr>
-    </w:p>
-    <w:p>
-      <w:pPr>
+      </w:pPr>
+      <w:r>
         <w:rPr>
           <w:b/>
           <w:bCs/>
           <w:sz w:val="28"/>
           <w:szCs w:val="28"/>
         </w:rPr>
-      </w:pPr>
-      <w:r>
+        <w:br w:type="page"/>
+      </w:r>
+    </w:p>
+    <w:p>
+      <w:pPr>
         <w:rPr>
           <w:b/>
           <w:bCs/>
           <w:sz w:val="28"/>
           <w:szCs w:val="28"/>
         </w:rPr>
+      </w:pPr>
+      <w:r>
+        <w:rPr>
+          <w:b/>
+          <w:bCs/>
+          <w:sz w:val="28"/>
+          <w:szCs w:val="28"/>
+        </w:rPr>
+        <w:lastRenderedPageBreak/>
         <w:t>Modelo Relacional</w:t>
       </w:r>
     </w:p>
@@ -152,7 +222,10 @@
     </w:p>
     <w:p>
       <w:r>
-        <w:t>La tabla ROL almacena los distintos perfiles de acceso del sistema, como operario, técnico, jefe de ST o administrador.</w:t>
+        <w:t>Almacena</w:t>
+      </w:r>
+      <w:r>
+        <w:t xml:space="preserve"> los distintos perfiles de acceso del sistema.</w:t>
       </w:r>
     </w:p>
     <w:tbl>
@@ -406,28 +479,15 @@
           <w:b/>
           <w:bCs/>
         </w:rPr>
-        <w:br w:type="page"/>
-      </w:r>
-    </w:p>
-    <w:p>
-      <w:pPr>
-        <w:rPr>
-          <w:b/>
-          <w:bCs/>
-        </w:rPr>
-      </w:pPr>
-      <w:r>
-        <w:rPr>
-          <w:b/>
-          <w:bCs/>
-        </w:rPr>
-        <w:lastRenderedPageBreak/>
         <w:t>USUARIO</w:t>
       </w:r>
     </w:p>
     <w:p>
       <w:r>
-        <w:t>La tabla USUARIO almacena todas las cuentas que pueden acceder al sistema, tanto operarios como personal técnico.</w:t>
+        <w:t>A</w:t>
+      </w:r>
+      <w:r>
+        <w:t>lmacena las cuentas del sistema.</w:t>
       </w:r>
     </w:p>
     <w:tbl>
@@ -878,12 +938,28 @@
           <w:b/>
           <w:bCs/>
         </w:rPr>
+        <w:br w:type="page"/>
+      </w:r>
+    </w:p>
+    <w:p>
+      <w:pPr>
+        <w:rPr>
+          <w:b/>
+          <w:bCs/>
+        </w:rPr>
+      </w:pPr>
+      <w:r>
+        <w:rPr>
+          <w:b/>
+          <w:bCs/>
+        </w:rPr>
+        <w:lastRenderedPageBreak/>
         <w:t>PUESTO</w:t>
       </w:r>
     </w:p>
     <w:p>
       <w:r>
-        <w:t>La tabla PUESTO identifica los puntos físicos o departamentos desde los que se generan incidencias.</w:t>
+        <w:t>Representa los puntos físicos o departamentos que generan incidencias.</w:t>
       </w:r>
     </w:p>
     <w:tbl>
@@ -977,6 +1053,7 @@
       </w:tr>
       <w:tr>
         <w:trPr>
+          <w:trHeight w:val="30"/>
           <w:tblCellSpacing w:w="15" w:type="dxa"/>
         </w:trPr>
         <w:tc>
@@ -1254,28 +1331,12 @@
           <w:b/>
           <w:bCs/>
         </w:rPr>
-        <w:br w:type="page"/>
-      </w:r>
-    </w:p>
-    <w:p>
-      <w:pPr>
-        <w:rPr>
-          <w:b/>
-          <w:bCs/>
-        </w:rPr>
-      </w:pPr>
-      <w:r>
-        <w:rPr>
-          <w:b/>
-          <w:bCs/>
-        </w:rPr>
-        <w:lastRenderedPageBreak/>
         <w:t>INCIDENCIA</w:t>
       </w:r>
     </w:p>
     <w:p>
       <w:r>
-        <w:t>La tabla INCIDENCIA es la entidad principal del sistema y almacena cada aviso generado por los puestos.</w:t>
+        <w:t>Entidad principal del sistema.</w:t>
       </w:r>
     </w:p>
     <w:tbl>
@@ -1820,7 +1881,7 @@
     </w:p>
     <w:p>
       <w:r>
-        <w:t>La tabla ASIGNACION relaciona técnicos con incidencias y permite múltiples participaciones.</w:t>
+        <w:t>Relación entre técnicos e incidencias.</w:t>
       </w:r>
     </w:p>
     <w:tbl>
@@ -1863,6 +1924,7 @@
                 <w:b/>
                 <w:bCs/>
               </w:rPr>
+              <w:lastRenderedPageBreak/>
               <w:t>Campo</w:t>
             </w:r>
           </w:p>
@@ -2186,33 +2248,25 @@
           <w:bCs/>
         </w:rPr>
       </w:pPr>
-      <w:r>
+    </w:p>
+    <w:p>
+      <w:pPr>
         <w:rPr>
           <w:b/>
           <w:bCs/>
         </w:rPr>
-        <w:br w:type="page"/>
-      </w:r>
-    </w:p>
-    <w:p>
-      <w:pPr>
+      </w:pPr>
+      <w:r>
         <w:rPr>
           <w:b/>
           <w:bCs/>
         </w:rPr>
-      </w:pPr>
-      <w:r>
-        <w:rPr>
-          <w:b/>
-          <w:bCs/>
-        </w:rPr>
-        <w:lastRenderedPageBreak/>
         <w:t>INFORME_RESOLUCION</w:t>
       </w:r>
     </w:p>
     <w:p>
       <w:r>
-        <w:t>La tabla INFORME_RESOLUCION almacena la solución técnica aplicada al cerrar una incidencia.</w:t>
+        <w:t>Almacena la solución técnica de la incidencia.</w:t>
       </w:r>
     </w:p>
     <w:tbl>
@@ -2550,12 +2604,28 @@
           <w:b/>
           <w:bCs/>
         </w:rPr>
+        <w:br w:type="page"/>
+      </w:r>
+    </w:p>
+    <w:p>
+      <w:pPr>
+        <w:rPr>
+          <w:b/>
+          <w:bCs/>
+        </w:rPr>
+      </w:pPr>
+      <w:r>
+        <w:rPr>
+          <w:b/>
+          <w:bCs/>
+        </w:rPr>
+        <w:lastRenderedPageBreak/>
         <w:t>HISTORIAL_INCIDENCIA</w:t>
       </w:r>
     </w:p>
     <w:p>
       <w:r>
-        <w:t>La tabla HISTORIAL_INCIDENCIA registra todos los cambios y acciones realizadas sobre una incidencia.</w:t>
+        <w:t>Registra todas las acciones sobre incidencias.</w:t>
       </w:r>
     </w:p>
     <w:tbl>
@@ -3031,10 +3101,7 @@
     </w:p>
     <w:p>
       <w:r>
-        <w:t>La tabla AUDITORIA registra</w:t>
-      </w:r>
-      <w:r>
-        <w:t xml:space="preserve"> operaciones de modificación sobre las tablas principales del sistema</w:t>
+        <w:t>Registra todas las operaciones del sistema.</w:t>
       </w:r>
     </w:p>
     <w:tbl>
@@ -3623,7 +3690,21 @@
     </w:tbl>
     <w:p/>
     <w:p>
-      <w:r>
+      <w:pPr>
+        <w:rPr>
+          <w:b/>
+          <w:bCs/>
+          <w:sz w:val="28"/>
+          <w:szCs w:val="28"/>
+        </w:rPr>
+      </w:pPr>
+      <w:r>
+        <w:rPr>
+          <w:b/>
+          <w:bCs/>
+          <w:sz w:val="28"/>
+          <w:szCs w:val="28"/>
+        </w:rPr>
         <w:br w:type="page"/>
       </w:r>
     </w:p>
@@ -3644,12 +3725,7 @@
           <w:szCs w:val="28"/>
         </w:rPr>
         <w:lastRenderedPageBreak/>
-        <w:t>Restricciones e integridad</w:t>
-      </w:r>
-    </w:p>
-    <w:p>
-      <w:r>
-        <w:t>Se han utilizado restricciones para limitar los valores posibles de prioridad y estado, garantizando la consistencia de los datos.</w:t>
+        <w:t>RESTRICCIONES E INTEGRIDAD</w:t>
       </w:r>
     </w:p>
     <w:p>
@@ -3669,12 +3745,7 @@
     </w:p>
     <w:p>
       <w:r>
-        <w:t>Todas las tablas disponen de una clave primaria que identifica de forma única cada registro.</w:t>
-      </w:r>
-    </w:p>
-    <w:p>
-      <w:r>
-        <w:t>Ejemplos:</w:t>
+        <w:t>Todas las tablas disponen de una clave primaria que identifica de forma única cada registro, evitando duplicidades.</w:t>
       </w:r>
     </w:p>
     <w:tbl>
@@ -3906,11 +3977,6 @@
       </w:tr>
     </w:tbl>
     <w:p>
-      <w:r>
-        <w:t>La utilización de claves primarias evita duplicidades y permite relacionar correctamente las entidades del sistema.</w:t>
-      </w:r>
-    </w:p>
-    <w:p>
       <w:pPr>
         <w:rPr>
           <w:b/>
@@ -3935,12 +4001,7 @@
     </w:p>
     <w:p>
       <w:r>
-        <w:t>Las claves foráneas garantizan la integridad referencial entre tablas.</w:t>
-      </w:r>
-    </w:p>
-    <w:p>
-      <w:r>
-        <w:t>Ejemplos implementados:</w:t>
+        <w:t>Garantizan la integridad referencial entre entidades:</w:t>
       </w:r>
     </w:p>
     <w:tbl>
@@ -4322,209 +4383,14 @@
           <w:b/>
           <w:bCs/>
         </w:rPr>
-        <w:lastRenderedPageBreak/>
         <w:t>Restricciones NOT NULL</w:t>
       </w:r>
     </w:p>
     <w:p>
       <w:r>
-        <w:t>Se han utilizado restricciones NOT NULL en campos obligatorios para impedir registros incompletos.</w:t>
-      </w:r>
-    </w:p>
-    <w:p>
-      <w:r>
-        <w:t>Ejemplos:</w:t>
-      </w:r>
-    </w:p>
-    <w:tbl>
-      <w:tblPr>
-        <w:tblW w:w="0" w:type="auto"/>
-        <w:tblCellSpacing w:w="15" w:type="dxa"/>
-        <w:tblCellMar>
-          <w:top w:w="15" w:type="dxa"/>
-          <w:left w:w="15" w:type="dxa"/>
-          <w:bottom w:w="15" w:type="dxa"/>
-          <w:right w:w="15" w:type="dxa"/>
-        </w:tblCellMar>
-        <w:tblLook w:val="04A0" w:firstRow="1" w:lastRow="0" w:firstColumn="1" w:lastColumn="0" w:noHBand="0" w:noVBand="1"/>
-      </w:tblPr>
-      <w:tblGrid>
-        <w:gridCol w:w="1697"/>
-        <w:gridCol w:w="4702"/>
-      </w:tblGrid>
-      <w:tr>
-        <w:trPr>
-          <w:tblHeader/>
-          <w:tblCellSpacing w:w="15" w:type="dxa"/>
-        </w:trPr>
-        <w:tc>
-          <w:tcPr>
-            <w:tcW w:w="0" w:type="auto"/>
-            <w:vAlign w:val="center"/>
-            <w:hideMark/>
-          </w:tcPr>
-          <w:p>
-            <w:pPr>
-              <w:rPr>
-                <w:b/>
-                <w:bCs/>
-              </w:rPr>
-            </w:pPr>
-            <w:r>
-              <w:rPr>
-                <w:b/>
-                <w:bCs/>
-              </w:rPr>
-              <w:t>Campo</w:t>
-            </w:r>
-          </w:p>
-        </w:tc>
-        <w:tc>
-          <w:tcPr>
-            <w:tcW w:w="0" w:type="auto"/>
-            <w:vAlign w:val="center"/>
-            <w:hideMark/>
-          </w:tcPr>
-          <w:p>
-            <w:pPr>
-              <w:rPr>
-                <w:b/>
-                <w:bCs/>
-              </w:rPr>
-            </w:pPr>
-            <w:r>
-              <w:rPr>
-                <w:b/>
-                <w:bCs/>
-              </w:rPr>
-              <w:t>Motivo</w:t>
-            </w:r>
-          </w:p>
-        </w:tc>
-      </w:tr>
-      <w:tr>
-        <w:trPr>
-          <w:tblCellSpacing w:w="15" w:type="dxa"/>
-        </w:trPr>
-        <w:tc>
-          <w:tcPr>
-            <w:tcW w:w="0" w:type="auto"/>
-            <w:vAlign w:val="center"/>
-            <w:hideMark/>
-          </w:tcPr>
-          <w:p>
-            <w:proofErr w:type="spellStart"/>
-            <w:r>
-              <w:t>username</w:t>
-            </w:r>
-            <w:proofErr w:type="spellEnd"/>
-          </w:p>
-        </w:tc>
-        <w:tc>
-          <w:tcPr>
-            <w:tcW w:w="0" w:type="auto"/>
-            <w:vAlign w:val="center"/>
-            <w:hideMark/>
-          </w:tcPr>
-          <w:p>
-            <w:r>
-              <w:t>El usuario debe tener identificador</w:t>
-            </w:r>
-          </w:p>
-        </w:tc>
-      </w:tr>
-      <w:tr>
-        <w:trPr>
-          <w:tblCellSpacing w:w="15" w:type="dxa"/>
-        </w:trPr>
-        <w:tc>
-          <w:tcPr>
-            <w:tcW w:w="0" w:type="auto"/>
-            <w:vAlign w:val="center"/>
-            <w:hideMark/>
-          </w:tcPr>
-          <w:p>
-            <w:proofErr w:type="spellStart"/>
-            <w:r>
-              <w:t>password_hash</w:t>
-            </w:r>
-            <w:proofErr w:type="spellEnd"/>
-          </w:p>
-        </w:tc>
-        <w:tc>
-          <w:tcPr>
-            <w:tcW w:w="0" w:type="auto"/>
-            <w:vAlign w:val="center"/>
-            <w:hideMark/>
-          </w:tcPr>
-          <w:p>
-            <w:r>
-              <w:t>La contraseña es obligatoria</w:t>
-            </w:r>
-          </w:p>
-        </w:tc>
-      </w:tr>
-      <w:tr>
-        <w:trPr>
-          <w:tblCellSpacing w:w="15" w:type="dxa"/>
-        </w:trPr>
-        <w:tc>
-          <w:tcPr>
-            <w:tcW w:w="0" w:type="auto"/>
-            <w:vAlign w:val="center"/>
-            <w:hideMark/>
-          </w:tcPr>
-          <w:p>
-            <w:r>
-              <w:t>estado</w:t>
-            </w:r>
-          </w:p>
-        </w:tc>
-        <w:tc>
-          <w:tcPr>
-            <w:tcW w:w="0" w:type="auto"/>
-            <w:vAlign w:val="center"/>
-            <w:hideMark/>
-          </w:tcPr>
-          <w:p>
-            <w:r>
-              <w:t>Toda incidencia debe tener estado</w:t>
-            </w:r>
-          </w:p>
-        </w:tc>
-      </w:tr>
-      <w:tr>
-        <w:trPr>
-          <w:tblCellSpacing w:w="15" w:type="dxa"/>
-        </w:trPr>
-        <w:tc>
-          <w:tcPr>
-            <w:tcW w:w="0" w:type="auto"/>
-            <w:vAlign w:val="center"/>
-            <w:hideMark/>
-          </w:tcPr>
-          <w:p>
-            <w:proofErr w:type="spellStart"/>
-            <w:r>
-              <w:t>id_puesto</w:t>
-            </w:r>
-            <w:proofErr w:type="spellEnd"/>
-          </w:p>
-        </w:tc>
-        <w:tc>
-          <w:tcPr>
-            <w:tcW w:w="0" w:type="auto"/>
-            <w:vAlign w:val="center"/>
-            <w:hideMark/>
-          </w:tcPr>
-          <w:p>
-            <w:r>
-              <w:t>Toda incidencia debe pertenecer a un puesto</w:t>
-            </w:r>
-          </w:p>
-        </w:tc>
-      </w:tr>
-    </w:tbl>
+        <w:t>Se aplican en campos obligatorios como usuario, contraseña o estado para evitar registros incompletos.</w:t>
+      </w:r>
+    </w:p>
     <w:p/>
     <w:p>
       <w:pPr>
@@ -4533,192 +4399,72 @@
           <w:bCs/>
         </w:rPr>
       </w:pPr>
-      <w:r>
+    </w:p>
+    <w:p>
+      <w:pPr>
         <w:rPr>
           <w:b/>
           <w:bCs/>
         </w:rPr>
+      </w:pPr>
+      <w:r>
+        <w:rPr>
+          <w:b/>
+          <w:bCs/>
+        </w:rPr>
+        <w:lastRenderedPageBreak/>
         <w:t>Restricciones UNIQUE</w:t>
       </w:r>
     </w:p>
     <w:p>
       <w:r>
-        <w:t>Las restricciones UNIQUE impiden valores duplicados en campos que deben ser únicos dentro del sistema.</w:t>
-      </w:r>
-    </w:p>
-    <w:p>
-      <w:r>
-        <w:t>Ejemplos:</w:t>
-      </w:r>
-    </w:p>
-    <w:tbl>
-      <w:tblPr>
-        <w:tblW w:w="6294" w:type="dxa"/>
-        <w:tblCellSpacing w:w="15" w:type="dxa"/>
-        <w:tblCellMar>
-          <w:top w:w="15" w:type="dxa"/>
-          <w:left w:w="15" w:type="dxa"/>
-          <w:bottom w:w="15" w:type="dxa"/>
-          <w:right w:w="15" w:type="dxa"/>
-        </w:tblCellMar>
-        <w:tblLook w:val="04A0" w:firstRow="1" w:lastRow="0" w:firstColumn="1" w:lastColumn="0" w:noHBand="0" w:noVBand="1"/>
-      </w:tblPr>
-      <w:tblGrid>
-        <w:gridCol w:w="3803"/>
-        <w:gridCol w:w="2491"/>
-      </w:tblGrid>
-      <w:tr>
-        <w:trPr>
-          <w:trHeight w:val="520"/>
-          <w:tblHeader/>
-          <w:tblCellSpacing w:w="15" w:type="dxa"/>
-        </w:trPr>
-        <w:tc>
-          <w:tcPr>
-            <w:tcW w:w="0" w:type="auto"/>
-            <w:vAlign w:val="center"/>
-            <w:hideMark/>
-          </w:tcPr>
-          <w:p>
-            <w:pPr>
-              <w:rPr>
-                <w:b/>
-                <w:bCs/>
-              </w:rPr>
-            </w:pPr>
-            <w:r>
-              <w:rPr>
-                <w:b/>
-                <w:bCs/>
-              </w:rPr>
-              <w:t>Campo</w:t>
-            </w:r>
-          </w:p>
-        </w:tc>
-        <w:tc>
-          <w:tcPr>
-            <w:tcW w:w="0" w:type="auto"/>
-            <w:vAlign w:val="center"/>
-            <w:hideMark/>
-          </w:tcPr>
-          <w:p>
-            <w:pPr>
-              <w:rPr>
-                <w:b/>
-                <w:bCs/>
-              </w:rPr>
-            </w:pPr>
-            <w:r>
-              <w:rPr>
-                <w:b/>
-                <w:bCs/>
-              </w:rPr>
-              <w:t>Tabla</w:t>
-            </w:r>
-          </w:p>
-        </w:tc>
-      </w:tr>
-      <w:tr>
-        <w:trPr>
-          <w:trHeight w:val="530"/>
-          <w:tblCellSpacing w:w="15" w:type="dxa"/>
-        </w:trPr>
-        <w:tc>
-          <w:tcPr>
-            <w:tcW w:w="0" w:type="auto"/>
-            <w:vAlign w:val="center"/>
-            <w:hideMark/>
-          </w:tcPr>
-          <w:p>
-            <w:proofErr w:type="spellStart"/>
-            <w:r>
-              <w:t>username</w:t>
-            </w:r>
-            <w:proofErr w:type="spellEnd"/>
-          </w:p>
-        </w:tc>
-        <w:tc>
-          <w:tcPr>
-            <w:tcW w:w="0" w:type="auto"/>
-            <w:vAlign w:val="center"/>
-            <w:hideMark/>
-          </w:tcPr>
-          <w:p>
-            <w:r>
-              <w:t>USUARIO</w:t>
-            </w:r>
-          </w:p>
-        </w:tc>
-      </w:tr>
-      <w:tr>
-        <w:trPr>
-          <w:trHeight w:val="530"/>
-          <w:tblCellSpacing w:w="15" w:type="dxa"/>
-        </w:trPr>
-        <w:tc>
-          <w:tcPr>
-            <w:tcW w:w="0" w:type="auto"/>
-            <w:vAlign w:val="center"/>
-            <w:hideMark/>
-          </w:tcPr>
-          <w:p>
-            <w:proofErr w:type="spellStart"/>
-            <w:r>
-              <w:t>codigo_puesto</w:t>
-            </w:r>
-            <w:proofErr w:type="spellEnd"/>
-          </w:p>
-        </w:tc>
-        <w:tc>
-          <w:tcPr>
-            <w:tcW w:w="0" w:type="auto"/>
-            <w:vAlign w:val="center"/>
-            <w:hideMark/>
-          </w:tcPr>
-          <w:p>
-            <w:r>
-              <w:t>PUESTO</w:t>
-            </w:r>
-          </w:p>
-        </w:tc>
-      </w:tr>
-      <w:tr>
-        <w:trPr>
-          <w:trHeight w:val="530"/>
-          <w:tblCellSpacing w:w="15" w:type="dxa"/>
-        </w:trPr>
-        <w:tc>
-          <w:tcPr>
-            <w:tcW w:w="0" w:type="auto"/>
-            <w:vAlign w:val="center"/>
-            <w:hideMark/>
-          </w:tcPr>
-          <w:p>
-            <w:proofErr w:type="spellStart"/>
-            <w:r>
-              <w:t>nombre_rol</w:t>
-            </w:r>
-            <w:proofErr w:type="spellEnd"/>
-          </w:p>
-        </w:tc>
-        <w:tc>
-          <w:tcPr>
-            <w:tcW w:w="0" w:type="auto"/>
-            <w:vAlign w:val="center"/>
-            <w:hideMark/>
-          </w:tcPr>
-          <w:p>
-            <w:r>
-              <w:t>ROL</w:t>
-            </w:r>
-          </w:p>
-        </w:tc>
-      </w:tr>
-    </w:tbl>
-    <w:p>
-      <w:r>
-        <w:t>Esto evita inconsistencias y conflictos de identificación.</w:t>
-      </w:r>
+        <w:t>Garantizan valores únicos en:</w:t>
+      </w:r>
+    </w:p>
+    <w:p>
+      <w:pPr>
+        <w:numPr>
+          <w:ilvl w:val="0"/>
+          <w:numId w:val="6"/>
+        </w:numPr>
+      </w:pPr>
+      <w:proofErr w:type="spellStart"/>
+      <w:r>
+        <w:t>username</w:t>
+      </w:r>
+      <w:proofErr w:type="spellEnd"/>
+      <w:r>
+        <w:t xml:space="preserve"> </w:t>
+      </w:r>
+    </w:p>
+    <w:p>
+      <w:pPr>
+        <w:numPr>
+          <w:ilvl w:val="0"/>
+          <w:numId w:val="6"/>
+        </w:numPr>
+      </w:pPr>
+      <w:proofErr w:type="spellStart"/>
+      <w:r>
+        <w:t>codigo_puesto</w:t>
+      </w:r>
+      <w:proofErr w:type="spellEnd"/>
+      <w:r>
+        <w:t xml:space="preserve"> </w:t>
+      </w:r>
+    </w:p>
+    <w:p>
+      <w:pPr>
+        <w:numPr>
+          <w:ilvl w:val="0"/>
+          <w:numId w:val="6"/>
+        </w:numPr>
+      </w:pPr>
+      <w:proofErr w:type="spellStart"/>
+      <w:r>
+        <w:t>nombre_rol</w:t>
+      </w:r>
+      <w:proofErr w:type="spellEnd"/>
     </w:p>
     <w:p/>
     <w:p>
@@ -4783,6 +4529,75 @@
         <w:t>CHECK (estado IN ('ACTIVA', 'EN_CURSO', 'RESUELTA', 'REABIERTA', 'CANCELADA'))</w:t>
       </w:r>
     </w:p>
+    <w:p/>
+    <w:p>
+      <w:pPr>
+        <w:rPr>
+          <w:b/>
+          <w:bCs/>
+        </w:rPr>
+      </w:pPr>
+      <w:r>
+        <w:rPr>
+          <w:b/>
+          <w:bCs/>
+        </w:rPr>
+        <w:t>INTEGRIDAD REFERENCIAL</w:t>
+      </w:r>
+    </w:p>
+    <w:p>
+      <w:r>
+        <w:t>La integridad referencial garantiza la coherencia entre tablas evitando referencias inválidas.</w:t>
+      </w:r>
+    </w:p>
+    <w:p>
+      <w:r>
+        <w:t>Ejemplos:</w:t>
+      </w:r>
+    </w:p>
+    <w:p>
+      <w:pPr>
+        <w:numPr>
+          <w:ilvl w:val="0"/>
+          <w:numId w:val="7"/>
+        </w:numPr>
+      </w:pPr>
+      <w:r>
+        <w:t xml:space="preserve">No puede existir una incidencia sin puesto asociado </w:t>
+      </w:r>
+    </w:p>
+    <w:p>
+      <w:pPr>
+        <w:numPr>
+          <w:ilvl w:val="0"/>
+          <w:numId w:val="7"/>
+        </w:numPr>
+      </w:pPr>
+      <w:r>
+        <w:t xml:space="preserve">No puede asignarse un técnico inexistente </w:t>
+      </w:r>
+    </w:p>
+    <w:p>
+      <w:pPr>
+        <w:numPr>
+          <w:ilvl w:val="0"/>
+          <w:numId w:val="7"/>
+        </w:numPr>
+      </w:pPr>
+      <w:r>
+        <w:t xml:space="preserve">No puede existir historial de registros inexistentes </w:t>
+      </w:r>
+    </w:p>
+    <w:p>
+      <w:r>
+        <w:t>En algunas relaciones se utiliza ON DELETE CASCADE, como en asignaciones, para eliminar automáticamente registros dependientes y mantener la coherencia del sistema.</w:t>
+      </w:r>
+    </w:p>
+    <w:p>
+      <w:r>
+        <w:br w:type="page"/>
+      </w:r>
+    </w:p>
     <w:p>
       <w:pPr>
         <w:rPr>
@@ -4796,102 +4611,118 @@
           <w:bCs/>
         </w:rPr>
         <w:lastRenderedPageBreak/>
-        <w:t>Integridad referencial</w:t>
-      </w:r>
-    </w:p>
-    <w:p>
-      <w:r>
-        <w:t>La integridad referencial garantiza que las relaciones entre entidades permanezcan consistentes.</w:t>
-      </w:r>
-    </w:p>
-    <w:p>
-      <w:r>
-        <w:t>Por ejemplo:</w:t>
+        <w:t>INTEGRIDAD MEDIANTE TRIGGERS</w:t>
+      </w:r>
+    </w:p>
+    <w:p>
+      <w:r>
+        <w:t xml:space="preserve">Se han implementado </w:t>
+      </w:r>
+      <w:proofErr w:type="spellStart"/>
+      <w:r>
+        <w:t>triggers</w:t>
+      </w:r>
+      <w:proofErr w:type="spellEnd"/>
+      <w:r>
+        <w:t xml:space="preserve"> para automatizar reglas de negocio y asegurar la consistencia del sistema.</w:t>
+      </w:r>
+    </w:p>
+    <w:p>
+      <w:proofErr w:type="spellStart"/>
+      <w:r>
+        <w:t>Triggers</w:t>
+      </w:r>
+      <w:proofErr w:type="spellEnd"/>
+      <w:r>
+        <w:t xml:space="preserve"> implementados:</w:t>
       </w:r>
     </w:p>
     <w:p>
       <w:pPr>
         <w:numPr>
           <w:ilvl w:val="0"/>
-          <w:numId w:val="3"/>
+          <w:numId w:val="8"/>
         </w:numPr>
       </w:pPr>
-      <w:r>
-        <w:t xml:space="preserve">No puede existir una incidencia asociada a un puesto inexistente. </w:t>
-      </w:r>
-    </w:p>
-    <w:p>
-      <w:pPr>
-        <w:numPr>
-          <w:ilvl w:val="0"/>
-          <w:numId w:val="3"/>
-        </w:numPr>
-      </w:pPr>
-      <w:r>
-        <w:t xml:space="preserve">No puede asignarse un técnico inexistente a una incidencia. </w:t>
-      </w:r>
-    </w:p>
-    <w:p>
-      <w:r>
-        <w:t>Además, en algunas relaciones se ha utilizado:</w:t>
-      </w:r>
-    </w:p>
-    <w:p>
-      <w:r>
-        <w:t>ON DELETE CASCADE</w:t>
-      </w:r>
-    </w:p>
-    <w:p>
-      <w:r>
-        <w:t xml:space="preserve">Esto permite </w:t>
-      </w:r>
-      <w:r>
-        <w:t>eliminar registros dependientes como asignaciones, garantizando la coherencia del sistema.</w:t>
-      </w:r>
-    </w:p>
-    <w:p>
-      <w:pPr>
+      <w:proofErr w:type="spellStart"/>
+      <w:r>
         <w:rPr>
           <w:b/>
           <w:bCs/>
         </w:rPr>
-      </w:pPr>
+        <w:t>trg_historial_estado</w:t>
+      </w:r>
+      <w:proofErr w:type="spellEnd"/>
+      <w:r>
+        <w:t xml:space="preserve">: registra cambios de estado en incidencias </w:t>
+      </w:r>
+    </w:p>
+    <w:p>
+      <w:pPr>
+        <w:numPr>
+          <w:ilvl w:val="0"/>
+          <w:numId w:val="8"/>
+        </w:numPr>
+      </w:pPr>
+      <w:proofErr w:type="spellStart"/>
       <w:r>
         <w:rPr>
           <w:b/>
           <w:bCs/>
         </w:rPr>
-        <w:t xml:space="preserve">Integridad mediante </w:t>
-      </w:r>
+        <w:t>trg_historial_asignacion</w:t>
+      </w:r>
+      <w:proofErr w:type="spellEnd"/>
+      <w:r>
+        <w:t xml:space="preserve">: registra asignaciones de técnicos </w:t>
+      </w:r>
+    </w:p>
+    <w:p>
+      <w:pPr>
+        <w:numPr>
+          <w:ilvl w:val="0"/>
+          <w:numId w:val="8"/>
+        </w:numPr>
+      </w:pPr>
       <w:proofErr w:type="spellStart"/>
       <w:r>
         <w:rPr>
           <w:b/>
           <w:bCs/>
         </w:rPr>
-        <w:t>triggers</w:t>
+        <w:t>trg_validar_cierre</w:t>
       </w:r>
       <w:proofErr w:type="spellEnd"/>
-    </w:p>
-    <w:p>
-      <w:r>
-        <w:t xml:space="preserve">Además de las restricciones estándar, se han implementado </w:t>
-      </w:r>
+      <w:r>
+        <w:t xml:space="preserve">: impide cerrar incidencias sin informe </w:t>
+      </w:r>
+    </w:p>
+    <w:p>
+      <w:pPr>
+        <w:numPr>
+          <w:ilvl w:val="0"/>
+          <w:numId w:val="8"/>
+        </w:numPr>
+      </w:pPr>
       <w:proofErr w:type="spellStart"/>
       <w:r>
-        <w:t>triggers</w:t>
-      </w:r>
-      <w:proofErr w:type="spellEnd"/>
-      <w:r>
-        <w:t xml:space="preserve"> para automatizar validaciones y garantizar reglas de negocio.</w:t>
-      </w:r>
-    </w:p>
-    <w:p>
-      <w:pPr>
         <w:rPr>
           <w:b/>
           <w:bCs/>
         </w:rPr>
+        <w:t>trg_gestion_fechas</w:t>
+      </w:r>
+      <w:proofErr w:type="spellEnd"/>
+      <w:r>
+        <w:t xml:space="preserve">: gestiona fechas de atención, resolución y reapertura </w:t>
+      </w:r>
+    </w:p>
+    <w:p>
+      <w:pPr>
+        <w:numPr>
+          <w:ilvl w:val="0"/>
+          <w:numId w:val="8"/>
+        </w:numPr>
       </w:pPr>
       <w:proofErr w:type="spellStart"/>
       <w:r>
@@ -4899,7 +4730,7 @@
           <w:b/>
           <w:bCs/>
         </w:rPr>
-        <w:t>Triggers</w:t>
+        <w:t>trg_auditoria_incidencia</w:t>
       </w:r>
       <w:proofErr w:type="spellEnd"/>
       <w:r>
@@ -4907,205 +4738,154 @@
           <w:b/>
           <w:bCs/>
         </w:rPr>
-        <w:t xml:space="preserve"> implementados</w:t>
-      </w:r>
-    </w:p>
-    <w:tbl>
-      <w:tblPr>
-        <w:tblW w:w="0" w:type="auto"/>
-        <w:tblCellSpacing w:w="15" w:type="dxa"/>
-        <w:tblCellMar>
-          <w:top w:w="15" w:type="dxa"/>
-          <w:left w:w="15" w:type="dxa"/>
-          <w:bottom w:w="15" w:type="dxa"/>
-          <w:right w:w="15" w:type="dxa"/>
-        </w:tblCellMar>
-        <w:tblLook w:val="04A0" w:firstRow="1" w:lastRow="0" w:firstColumn="1" w:lastColumn="0" w:noHBand="0" w:noVBand="1"/>
-      </w:tblPr>
-      <w:tblGrid>
-        <w:gridCol w:w="2567"/>
-        <w:gridCol w:w="5937"/>
-      </w:tblGrid>
-      <w:tr>
-        <w:trPr>
-          <w:tblHeader/>
-          <w:tblCellSpacing w:w="15" w:type="dxa"/>
-        </w:trPr>
-        <w:tc>
-          <w:tcPr>
-            <w:tcW w:w="0" w:type="auto"/>
-            <w:vAlign w:val="center"/>
-            <w:hideMark/>
-          </w:tcPr>
-          <w:p>
-            <w:pPr>
-              <w:rPr>
-                <w:b/>
-                <w:bCs/>
-              </w:rPr>
-            </w:pPr>
-            <w:r>
-              <w:rPr>
-                <w:b/>
-                <w:bCs/>
-              </w:rPr>
-              <w:t>Trigger</w:t>
-            </w:r>
-          </w:p>
-        </w:tc>
-        <w:tc>
-          <w:tcPr>
-            <w:tcW w:w="0" w:type="auto"/>
-            <w:vAlign w:val="center"/>
-            <w:hideMark/>
-          </w:tcPr>
-          <w:p>
-            <w:pPr>
-              <w:rPr>
-                <w:b/>
-                <w:bCs/>
-              </w:rPr>
-            </w:pPr>
-            <w:r>
-              <w:rPr>
-                <w:b/>
-                <w:bCs/>
-              </w:rPr>
-              <w:t>Función</w:t>
-            </w:r>
-          </w:p>
-        </w:tc>
-      </w:tr>
-      <w:tr>
-        <w:trPr>
-          <w:tblCellSpacing w:w="15" w:type="dxa"/>
-        </w:trPr>
-        <w:tc>
-          <w:tcPr>
-            <w:tcW w:w="0" w:type="auto"/>
-            <w:vAlign w:val="center"/>
-            <w:hideMark/>
-          </w:tcPr>
-          <w:p>
-            <w:proofErr w:type="spellStart"/>
-            <w:r>
-              <w:t>trg_historial_estado</w:t>
-            </w:r>
-            <w:proofErr w:type="spellEnd"/>
-          </w:p>
-        </w:tc>
-        <w:tc>
-          <w:tcPr>
-            <w:tcW w:w="0" w:type="auto"/>
-            <w:vAlign w:val="center"/>
-            <w:hideMark/>
-          </w:tcPr>
-          <w:p>
-            <w:r>
-              <w:t>Registra cambios de estado</w:t>
-            </w:r>
-          </w:p>
-        </w:tc>
-      </w:tr>
-      <w:tr>
-        <w:trPr>
-          <w:tblCellSpacing w:w="15" w:type="dxa"/>
-        </w:trPr>
-        <w:tc>
-          <w:tcPr>
-            <w:tcW w:w="0" w:type="auto"/>
-            <w:vAlign w:val="center"/>
-            <w:hideMark/>
-          </w:tcPr>
-          <w:p>
-            <w:proofErr w:type="spellStart"/>
-            <w:r>
-              <w:t>trg_validar_cierre</w:t>
-            </w:r>
-            <w:proofErr w:type="spellEnd"/>
-          </w:p>
-        </w:tc>
-        <w:tc>
-          <w:tcPr>
-            <w:tcW w:w="0" w:type="auto"/>
-            <w:vAlign w:val="center"/>
-            <w:hideMark/>
-          </w:tcPr>
-          <w:p>
-            <w:r>
-              <w:t>Impide cerrar incidencias sin informe</w:t>
-            </w:r>
-          </w:p>
-        </w:tc>
-      </w:tr>
-      <w:tr>
-        <w:trPr>
-          <w:tblCellSpacing w:w="15" w:type="dxa"/>
-        </w:trPr>
-        <w:tc>
-          <w:tcPr>
-            <w:tcW w:w="0" w:type="auto"/>
-            <w:vAlign w:val="center"/>
-            <w:hideMark/>
-          </w:tcPr>
-          <w:p>
-            <w:proofErr w:type="spellStart"/>
-            <w:r>
-              <w:t>trg_gestion_fechas</w:t>
-            </w:r>
-            <w:proofErr w:type="spellEnd"/>
-          </w:p>
-        </w:tc>
-        <w:tc>
-          <w:tcPr>
-            <w:tcW w:w="0" w:type="auto"/>
-            <w:vAlign w:val="center"/>
-            <w:hideMark/>
-          </w:tcPr>
-          <w:p>
-            <w:r>
-              <w:t>Gestiona automáticamente fechas de inicio, resolución y reapertura de incidencias.</w:t>
-            </w:r>
-          </w:p>
-        </w:tc>
-      </w:tr>
-      <w:tr>
-        <w:trPr>
-          <w:tblCellSpacing w:w="15" w:type="dxa"/>
-        </w:trPr>
-        <w:tc>
-          <w:tcPr>
-            <w:tcW w:w="0" w:type="auto"/>
-            <w:vAlign w:val="center"/>
-            <w:hideMark/>
-          </w:tcPr>
-          <w:p>
-            <w:proofErr w:type="spellStart"/>
-            <w:r>
-              <w:t>trg_auditoria_incidencia</w:t>
-            </w:r>
-            <w:proofErr w:type="spellEnd"/>
-          </w:p>
-        </w:tc>
-        <w:tc>
-          <w:tcPr>
-            <w:tcW w:w="0" w:type="auto"/>
-            <w:vAlign w:val="center"/>
-            <w:hideMark/>
-          </w:tcPr>
-          <w:p>
-            <w:r>
-              <w:t>Genera auditoría automática</w:t>
-            </w:r>
-          </w:p>
-        </w:tc>
-      </w:tr>
-    </w:tbl>
-    <w:p>
-      <w:r>
-        <w:t>Estos mecanismos aumentan la trazabilidad y automatizan el control de la información.</w:t>
-      </w:r>
-    </w:p>
+        <w:t xml:space="preserve"> / usuario</w:t>
+      </w:r>
+      <w:r>
+        <w:t>: genera auditoría automática</w:t>
+      </w:r>
+    </w:p>
+    <w:p/>
+    <w:p>
+      <w:pPr>
+        <w:rPr>
+          <w:b/>
+          <w:bCs/>
+        </w:rPr>
+      </w:pPr>
+      <w:r>
+        <w:rPr>
+          <w:b/>
+          <w:bCs/>
+        </w:rPr>
+        <w:t>RELACIONES DEL SISTEMA</w:t>
+      </w:r>
+    </w:p>
+    <w:p>
+      <w:pPr>
+        <w:numPr>
+          <w:ilvl w:val="0"/>
+          <w:numId w:val="9"/>
+        </w:numPr>
+      </w:pPr>
+      <w:r>
+        <w:t>Un rol puede tener múltiples usuarios (</w:t>
+      </w:r>
+      <w:proofErr w:type="gramStart"/>
+      <w:r>
+        <w:t>1:N</w:t>
+      </w:r>
+      <w:proofErr w:type="gramEnd"/>
+      <w:r>
+        <w:t xml:space="preserve">) </w:t>
+      </w:r>
+    </w:p>
+    <w:p>
+      <w:pPr>
+        <w:numPr>
+          <w:ilvl w:val="0"/>
+          <w:numId w:val="9"/>
+        </w:numPr>
+      </w:pPr>
+      <w:r>
+        <w:t>Un usuario puede crear múltiples incidencias (</w:t>
+      </w:r>
+      <w:proofErr w:type="gramStart"/>
+      <w:r>
+        <w:t>1:N</w:t>
+      </w:r>
+      <w:proofErr w:type="gramEnd"/>
+      <w:r>
+        <w:t xml:space="preserve">) </w:t>
+      </w:r>
+    </w:p>
+    <w:p>
+      <w:pPr>
+        <w:numPr>
+          <w:ilvl w:val="0"/>
+          <w:numId w:val="9"/>
+        </w:numPr>
+      </w:pPr>
+      <w:r>
+        <w:t>Un puesto puede generar múltiples incidencias (</w:t>
+      </w:r>
+      <w:proofErr w:type="gramStart"/>
+      <w:r>
+        <w:t>1:N</w:t>
+      </w:r>
+      <w:proofErr w:type="gramEnd"/>
+      <w:r>
+        <w:t xml:space="preserve">) </w:t>
+      </w:r>
+    </w:p>
+    <w:p>
+      <w:pPr>
+        <w:numPr>
+          <w:ilvl w:val="0"/>
+          <w:numId w:val="9"/>
+        </w:numPr>
+      </w:pPr>
+      <w:r>
+        <w:t>Una incidencia puede tener múltiples asignaciones (</w:t>
+      </w:r>
+      <w:proofErr w:type="gramStart"/>
+      <w:r>
+        <w:t>1:N</w:t>
+      </w:r>
+      <w:proofErr w:type="gramEnd"/>
+      <w:r>
+        <w:t xml:space="preserve">) </w:t>
+      </w:r>
+    </w:p>
+    <w:p>
+      <w:pPr>
+        <w:numPr>
+          <w:ilvl w:val="0"/>
+          <w:numId w:val="9"/>
+        </w:numPr>
+      </w:pPr>
+      <w:r>
+        <w:t xml:space="preserve">Una incidencia tiene un único informe de resolución (1:1) </w:t>
+      </w:r>
+    </w:p>
+    <w:p>
+      <w:pPr>
+        <w:numPr>
+          <w:ilvl w:val="0"/>
+          <w:numId w:val="9"/>
+        </w:numPr>
+      </w:pPr>
+      <w:r>
+        <w:t>Una incidencia puede tener múltiples registros de historial (</w:t>
+      </w:r>
+      <w:proofErr w:type="gramStart"/>
+      <w:r>
+        <w:t>1:N</w:t>
+      </w:r>
+      <w:proofErr w:type="gramEnd"/>
+      <w:r>
+        <w:t xml:space="preserve">) </w:t>
+      </w:r>
+    </w:p>
+    <w:p>
+      <w:pPr>
+        <w:numPr>
+          <w:ilvl w:val="0"/>
+          <w:numId w:val="9"/>
+        </w:numPr>
+      </w:pPr>
+      <w:r>
+        <w:t>Un usuario puede generar múltiples registros de auditoría (</w:t>
+      </w:r>
+      <w:proofErr w:type="gramStart"/>
+      <w:r>
+        <w:t>1:N</w:t>
+      </w:r>
+      <w:proofErr w:type="gramEnd"/>
+      <w:r>
+        <w:t>)</w:t>
+      </w:r>
+    </w:p>
+    <w:p/>
     <w:sectPr>
       <w:pgSz w:w="11906" w:h="16838"/>
       <w:pgMar w:top="1417" w:right="1701" w:bottom="1417" w:left="1701" w:header="708" w:footer="708" w:gutter="0"/>
@@ -5268,6 +5048,453 @@
     </w:lvl>
   </w:abstractNum>
   <w:abstractNum w:abstractNumId="1" w15:restartNumberingAfterBreak="0">
+    <w:nsid w:val="13F83D29"/>
+    <w:multiLevelType w:val="multilevel"/>
+    <w:tmpl w:val="27CC192A"/>
+    <w:lvl w:ilvl="0">
+      <w:start w:val="1"/>
+      <w:numFmt w:val="bullet"/>
+      <w:lvlText w:val=""/>
+      <w:lvlJc w:val="left"/>
+      <w:pPr>
+        <w:tabs>
+          <w:tab w:val="num" w:pos="720"/>
+        </w:tabs>
+        <w:ind w:left="720" w:hanging="360"/>
+      </w:pPr>
+      <w:rPr>
+        <w:rFonts w:ascii="Symbol" w:hAnsi="Symbol" w:hint="default"/>
+        <w:sz w:val="20"/>
+      </w:rPr>
+    </w:lvl>
+    <w:lvl w:ilvl="1" w:tentative="1">
+      <w:start w:val="1"/>
+      <w:numFmt w:val="bullet"/>
+      <w:lvlText w:val="o"/>
+      <w:lvlJc w:val="left"/>
+      <w:pPr>
+        <w:tabs>
+          <w:tab w:val="num" w:pos="1440"/>
+        </w:tabs>
+        <w:ind w:left="1440" w:hanging="360"/>
+      </w:pPr>
+      <w:rPr>
+        <w:rFonts w:ascii="Courier New" w:hAnsi="Courier New" w:hint="default"/>
+        <w:sz w:val="20"/>
+      </w:rPr>
+    </w:lvl>
+    <w:lvl w:ilvl="2" w:tentative="1">
+      <w:start w:val="1"/>
+      <w:numFmt w:val="bullet"/>
+      <w:lvlText w:val=""/>
+      <w:lvlJc w:val="left"/>
+      <w:pPr>
+        <w:tabs>
+          <w:tab w:val="num" w:pos="2160"/>
+        </w:tabs>
+        <w:ind w:left="2160" w:hanging="360"/>
+      </w:pPr>
+      <w:rPr>
+        <w:rFonts w:ascii="Wingdings" w:hAnsi="Wingdings" w:hint="default"/>
+        <w:sz w:val="20"/>
+      </w:rPr>
+    </w:lvl>
+    <w:lvl w:ilvl="3" w:tentative="1">
+      <w:start w:val="1"/>
+      <w:numFmt w:val="bullet"/>
+      <w:lvlText w:val=""/>
+      <w:lvlJc w:val="left"/>
+      <w:pPr>
+        <w:tabs>
+          <w:tab w:val="num" w:pos="2880"/>
+        </w:tabs>
+        <w:ind w:left="2880" w:hanging="360"/>
+      </w:pPr>
+      <w:rPr>
+        <w:rFonts w:ascii="Wingdings" w:hAnsi="Wingdings" w:hint="default"/>
+        <w:sz w:val="20"/>
+      </w:rPr>
+    </w:lvl>
+    <w:lvl w:ilvl="4" w:tentative="1">
+      <w:start w:val="1"/>
+      <w:numFmt w:val="bullet"/>
+      <w:lvlText w:val=""/>
+      <w:lvlJc w:val="left"/>
+      <w:pPr>
+        <w:tabs>
+          <w:tab w:val="num" w:pos="3600"/>
+        </w:tabs>
+        <w:ind w:left="3600" w:hanging="360"/>
+      </w:pPr>
+      <w:rPr>
+        <w:rFonts w:ascii="Wingdings" w:hAnsi="Wingdings" w:hint="default"/>
+        <w:sz w:val="20"/>
+      </w:rPr>
+    </w:lvl>
+    <w:lvl w:ilvl="5" w:tentative="1">
+      <w:start w:val="1"/>
+      <w:numFmt w:val="bullet"/>
+      <w:lvlText w:val=""/>
+      <w:lvlJc w:val="left"/>
+      <w:pPr>
+        <w:tabs>
+          <w:tab w:val="num" w:pos="4320"/>
+        </w:tabs>
+        <w:ind w:left="4320" w:hanging="360"/>
+      </w:pPr>
+      <w:rPr>
+        <w:rFonts w:ascii="Wingdings" w:hAnsi="Wingdings" w:hint="default"/>
+        <w:sz w:val="20"/>
+      </w:rPr>
+    </w:lvl>
+    <w:lvl w:ilvl="6" w:tentative="1">
+      <w:start w:val="1"/>
+      <w:numFmt w:val="bullet"/>
+      <w:lvlText w:val=""/>
+      <w:lvlJc w:val="left"/>
+      <w:pPr>
+        <w:tabs>
+          <w:tab w:val="num" w:pos="5040"/>
+        </w:tabs>
+        <w:ind w:left="5040" w:hanging="360"/>
+      </w:pPr>
+      <w:rPr>
+        <w:rFonts w:ascii="Wingdings" w:hAnsi="Wingdings" w:hint="default"/>
+        <w:sz w:val="20"/>
+      </w:rPr>
+    </w:lvl>
+    <w:lvl w:ilvl="7" w:tentative="1">
+      <w:start w:val="1"/>
+      <w:numFmt w:val="bullet"/>
+      <w:lvlText w:val=""/>
+      <w:lvlJc w:val="left"/>
+      <w:pPr>
+        <w:tabs>
+          <w:tab w:val="num" w:pos="5760"/>
+        </w:tabs>
+        <w:ind w:left="5760" w:hanging="360"/>
+      </w:pPr>
+      <w:rPr>
+        <w:rFonts w:ascii="Wingdings" w:hAnsi="Wingdings" w:hint="default"/>
+        <w:sz w:val="20"/>
+      </w:rPr>
+    </w:lvl>
+    <w:lvl w:ilvl="8" w:tentative="1">
+      <w:start w:val="1"/>
+      <w:numFmt w:val="bullet"/>
+      <w:lvlText w:val=""/>
+      <w:lvlJc w:val="left"/>
+      <w:pPr>
+        <w:tabs>
+          <w:tab w:val="num" w:pos="6480"/>
+        </w:tabs>
+        <w:ind w:left="6480" w:hanging="360"/>
+      </w:pPr>
+      <w:rPr>
+        <w:rFonts w:ascii="Wingdings" w:hAnsi="Wingdings" w:hint="default"/>
+        <w:sz w:val="20"/>
+      </w:rPr>
+    </w:lvl>
+  </w:abstractNum>
+  <w:abstractNum w:abstractNumId="2" w15:restartNumberingAfterBreak="0">
+    <w:nsid w:val="15C60275"/>
+    <w:multiLevelType w:val="multilevel"/>
+    <w:tmpl w:val="F8CAF2B8"/>
+    <w:lvl w:ilvl="0">
+      <w:start w:val="1"/>
+      <w:numFmt w:val="bullet"/>
+      <w:lvlText w:val=""/>
+      <w:lvlJc w:val="left"/>
+      <w:pPr>
+        <w:tabs>
+          <w:tab w:val="num" w:pos="720"/>
+        </w:tabs>
+        <w:ind w:left="720" w:hanging="360"/>
+      </w:pPr>
+      <w:rPr>
+        <w:rFonts w:ascii="Symbol" w:hAnsi="Symbol" w:hint="default"/>
+        <w:sz w:val="20"/>
+      </w:rPr>
+    </w:lvl>
+    <w:lvl w:ilvl="1" w:tentative="1">
+      <w:start w:val="1"/>
+      <w:numFmt w:val="bullet"/>
+      <w:lvlText w:val="o"/>
+      <w:lvlJc w:val="left"/>
+      <w:pPr>
+        <w:tabs>
+          <w:tab w:val="num" w:pos="1440"/>
+        </w:tabs>
+        <w:ind w:left="1440" w:hanging="360"/>
+      </w:pPr>
+      <w:rPr>
+        <w:rFonts w:ascii="Courier New" w:hAnsi="Courier New" w:hint="default"/>
+        <w:sz w:val="20"/>
+      </w:rPr>
+    </w:lvl>
+    <w:lvl w:ilvl="2" w:tentative="1">
+      <w:start w:val="1"/>
+      <w:numFmt w:val="bullet"/>
+      <w:lvlText w:val=""/>
+      <w:lvlJc w:val="left"/>
+      <w:pPr>
+        <w:tabs>
+          <w:tab w:val="num" w:pos="2160"/>
+        </w:tabs>
+        <w:ind w:left="2160" w:hanging="360"/>
+      </w:pPr>
+      <w:rPr>
+        <w:rFonts w:ascii="Wingdings" w:hAnsi="Wingdings" w:hint="default"/>
+        <w:sz w:val="20"/>
+      </w:rPr>
+    </w:lvl>
+    <w:lvl w:ilvl="3" w:tentative="1">
+      <w:start w:val="1"/>
+      <w:numFmt w:val="bullet"/>
+      <w:lvlText w:val=""/>
+      <w:lvlJc w:val="left"/>
+      <w:pPr>
+        <w:tabs>
+          <w:tab w:val="num" w:pos="2880"/>
+        </w:tabs>
+        <w:ind w:left="2880" w:hanging="360"/>
+      </w:pPr>
+      <w:rPr>
+        <w:rFonts w:ascii="Wingdings" w:hAnsi="Wingdings" w:hint="default"/>
+        <w:sz w:val="20"/>
+      </w:rPr>
+    </w:lvl>
+    <w:lvl w:ilvl="4" w:tentative="1">
+      <w:start w:val="1"/>
+      <w:numFmt w:val="bullet"/>
+      <w:lvlText w:val=""/>
+      <w:lvlJc w:val="left"/>
+      <w:pPr>
+        <w:tabs>
+          <w:tab w:val="num" w:pos="3600"/>
+        </w:tabs>
+        <w:ind w:left="3600" w:hanging="360"/>
+      </w:pPr>
+      <w:rPr>
+        <w:rFonts w:ascii="Wingdings" w:hAnsi="Wingdings" w:hint="default"/>
+        <w:sz w:val="20"/>
+      </w:rPr>
+    </w:lvl>
+    <w:lvl w:ilvl="5" w:tentative="1">
+      <w:start w:val="1"/>
+      <w:numFmt w:val="bullet"/>
+      <w:lvlText w:val=""/>
+      <w:lvlJc w:val="left"/>
+      <w:pPr>
+        <w:tabs>
+          <w:tab w:val="num" w:pos="4320"/>
+        </w:tabs>
+        <w:ind w:left="4320" w:hanging="360"/>
+      </w:pPr>
+      <w:rPr>
+        <w:rFonts w:ascii="Wingdings" w:hAnsi="Wingdings" w:hint="default"/>
+        <w:sz w:val="20"/>
+      </w:rPr>
+    </w:lvl>
+    <w:lvl w:ilvl="6" w:tentative="1">
+      <w:start w:val="1"/>
+      <w:numFmt w:val="bullet"/>
+      <w:lvlText w:val=""/>
+      <w:lvlJc w:val="left"/>
+      <w:pPr>
+        <w:tabs>
+          <w:tab w:val="num" w:pos="5040"/>
+        </w:tabs>
+        <w:ind w:left="5040" w:hanging="360"/>
+      </w:pPr>
+      <w:rPr>
+        <w:rFonts w:ascii="Wingdings" w:hAnsi="Wingdings" w:hint="default"/>
+        <w:sz w:val="20"/>
+      </w:rPr>
+    </w:lvl>
+    <w:lvl w:ilvl="7" w:tentative="1">
+      <w:start w:val="1"/>
+      <w:numFmt w:val="bullet"/>
+      <w:lvlText w:val=""/>
+      <w:lvlJc w:val="left"/>
+      <w:pPr>
+        <w:tabs>
+          <w:tab w:val="num" w:pos="5760"/>
+        </w:tabs>
+        <w:ind w:left="5760" w:hanging="360"/>
+      </w:pPr>
+      <w:rPr>
+        <w:rFonts w:ascii="Wingdings" w:hAnsi="Wingdings" w:hint="default"/>
+        <w:sz w:val="20"/>
+      </w:rPr>
+    </w:lvl>
+    <w:lvl w:ilvl="8" w:tentative="1">
+      <w:start w:val="1"/>
+      <w:numFmt w:val="bullet"/>
+      <w:lvlText w:val=""/>
+      <w:lvlJc w:val="left"/>
+      <w:pPr>
+        <w:tabs>
+          <w:tab w:val="num" w:pos="6480"/>
+        </w:tabs>
+        <w:ind w:left="6480" w:hanging="360"/>
+      </w:pPr>
+      <w:rPr>
+        <w:rFonts w:ascii="Wingdings" w:hAnsi="Wingdings" w:hint="default"/>
+        <w:sz w:val="20"/>
+      </w:rPr>
+    </w:lvl>
+  </w:abstractNum>
+  <w:abstractNum w:abstractNumId="3" w15:restartNumberingAfterBreak="0">
+    <w:nsid w:val="1D587616"/>
+    <w:multiLevelType w:val="multilevel"/>
+    <w:tmpl w:val="EFCE5E6A"/>
+    <w:lvl w:ilvl="0">
+      <w:start w:val="1"/>
+      <w:numFmt w:val="bullet"/>
+      <w:lvlText w:val=""/>
+      <w:lvlJc w:val="left"/>
+      <w:pPr>
+        <w:tabs>
+          <w:tab w:val="num" w:pos="720"/>
+        </w:tabs>
+        <w:ind w:left="720" w:hanging="360"/>
+      </w:pPr>
+      <w:rPr>
+        <w:rFonts w:ascii="Symbol" w:hAnsi="Symbol" w:hint="default"/>
+        <w:sz w:val="20"/>
+      </w:rPr>
+    </w:lvl>
+    <w:lvl w:ilvl="1" w:tentative="1">
+      <w:start w:val="1"/>
+      <w:numFmt w:val="bullet"/>
+      <w:lvlText w:val="o"/>
+      <w:lvlJc w:val="left"/>
+      <w:pPr>
+        <w:tabs>
+          <w:tab w:val="num" w:pos="1440"/>
+        </w:tabs>
+        <w:ind w:left="1440" w:hanging="360"/>
+      </w:pPr>
+      <w:rPr>
+        <w:rFonts w:ascii="Courier New" w:hAnsi="Courier New" w:hint="default"/>
+        <w:sz w:val="20"/>
+      </w:rPr>
+    </w:lvl>
+    <w:lvl w:ilvl="2" w:tentative="1">
+      <w:start w:val="1"/>
+      <w:numFmt w:val="bullet"/>
+      <w:lvlText w:val=""/>
+      <w:lvlJc w:val="left"/>
+      <w:pPr>
+        <w:tabs>
+          <w:tab w:val="num" w:pos="2160"/>
+        </w:tabs>
+        <w:ind w:left="2160" w:hanging="360"/>
+      </w:pPr>
+      <w:rPr>
+        <w:rFonts w:ascii="Wingdings" w:hAnsi="Wingdings" w:hint="default"/>
+        <w:sz w:val="20"/>
+      </w:rPr>
+    </w:lvl>
+    <w:lvl w:ilvl="3" w:tentative="1">
+      <w:start w:val="1"/>
+      <w:numFmt w:val="bullet"/>
+      <w:lvlText w:val=""/>
+      <w:lvlJc w:val="left"/>
+      <w:pPr>
+        <w:tabs>
+          <w:tab w:val="num" w:pos="2880"/>
+        </w:tabs>
+        <w:ind w:left="2880" w:hanging="360"/>
+      </w:pPr>
+      <w:rPr>
+        <w:rFonts w:ascii="Wingdings" w:hAnsi="Wingdings" w:hint="default"/>
+        <w:sz w:val="20"/>
+      </w:rPr>
+    </w:lvl>
+    <w:lvl w:ilvl="4" w:tentative="1">
+      <w:start w:val="1"/>
+      <w:numFmt w:val="bullet"/>
+      <w:lvlText w:val=""/>
+      <w:lvlJc w:val="left"/>
+      <w:pPr>
+        <w:tabs>
+          <w:tab w:val="num" w:pos="3600"/>
+        </w:tabs>
+        <w:ind w:left="3600" w:hanging="360"/>
+      </w:pPr>
+      <w:rPr>
+        <w:rFonts w:ascii="Wingdings" w:hAnsi="Wingdings" w:hint="default"/>
+        <w:sz w:val="20"/>
+      </w:rPr>
+    </w:lvl>
+    <w:lvl w:ilvl="5" w:tentative="1">
+      <w:start w:val="1"/>
+      <w:numFmt w:val="bullet"/>
+      <w:lvlText w:val=""/>
+      <w:lvlJc w:val="left"/>
+      <w:pPr>
+        <w:tabs>
+          <w:tab w:val="num" w:pos="4320"/>
+        </w:tabs>
+        <w:ind w:left="4320" w:hanging="360"/>
+      </w:pPr>
+      <w:rPr>
+        <w:rFonts w:ascii="Wingdings" w:hAnsi="Wingdings" w:hint="default"/>
+        <w:sz w:val="20"/>
+      </w:rPr>
+    </w:lvl>
+    <w:lvl w:ilvl="6" w:tentative="1">
+      <w:start w:val="1"/>
+      <w:numFmt w:val="bullet"/>
+      <w:lvlText w:val=""/>
+      <w:lvlJc w:val="left"/>
+      <w:pPr>
+        <w:tabs>
+          <w:tab w:val="num" w:pos="5040"/>
+        </w:tabs>
+        <w:ind w:left="5040" w:hanging="360"/>
+      </w:pPr>
+      <w:rPr>
+        <w:rFonts w:ascii="Wingdings" w:hAnsi="Wingdings" w:hint="default"/>
+        <w:sz w:val="20"/>
+      </w:rPr>
+    </w:lvl>
+    <w:lvl w:ilvl="7" w:tentative="1">
+      <w:start w:val="1"/>
+      <w:numFmt w:val="bullet"/>
+      <w:lvlText w:val=""/>
+      <w:lvlJc w:val="left"/>
+      <w:pPr>
+        <w:tabs>
+          <w:tab w:val="num" w:pos="5760"/>
+        </w:tabs>
+        <w:ind w:left="5760" w:hanging="360"/>
+      </w:pPr>
+      <w:rPr>
+        <w:rFonts w:ascii="Wingdings" w:hAnsi="Wingdings" w:hint="default"/>
+        <w:sz w:val="20"/>
+      </w:rPr>
+    </w:lvl>
+    <w:lvl w:ilvl="8" w:tentative="1">
+      <w:start w:val="1"/>
+      <w:numFmt w:val="bullet"/>
+      <w:lvlText w:val=""/>
+      <w:lvlJc w:val="left"/>
+      <w:pPr>
+        <w:tabs>
+          <w:tab w:val="num" w:pos="6480"/>
+        </w:tabs>
+        <w:ind w:left="6480" w:hanging="360"/>
+      </w:pPr>
+      <w:rPr>
+        <w:rFonts w:ascii="Wingdings" w:hAnsi="Wingdings" w:hint="default"/>
+        <w:sz w:val="20"/>
+      </w:rPr>
+    </w:lvl>
+  </w:abstractNum>
+  <w:abstractNum w:abstractNumId="4" w15:restartNumberingAfterBreak="0">
     <w:nsid w:val="248249C3"/>
     <w:multiLevelType w:val="multilevel"/>
     <w:tmpl w:val="191E17F0"/>
@@ -5416,7 +5643,7 @@
       </w:rPr>
     </w:lvl>
   </w:abstractNum>
-  <w:abstractNum w:abstractNumId="2" w15:restartNumberingAfterBreak="0">
+  <w:abstractNum w:abstractNumId="5" w15:restartNumberingAfterBreak="0">
     <w:nsid w:val="2A413A9A"/>
     <w:multiLevelType w:val="multilevel"/>
     <w:tmpl w:val="D94CEE24"/>
@@ -5565,7 +5792,7 @@
       </w:rPr>
     </w:lvl>
   </w:abstractNum>
-  <w:abstractNum w:abstractNumId="3" w15:restartNumberingAfterBreak="0">
+  <w:abstractNum w:abstractNumId="6" w15:restartNumberingAfterBreak="0">
     <w:nsid w:val="48CF01C5"/>
     <w:multiLevelType w:val="multilevel"/>
     <w:tmpl w:val="463A7D0C"/>
@@ -5714,17 +5941,330 @@
       </w:rPr>
     </w:lvl>
   </w:abstractNum>
+  <w:abstractNum w:abstractNumId="7" w15:restartNumberingAfterBreak="0">
+    <w:nsid w:val="61C226DB"/>
+    <w:multiLevelType w:val="multilevel"/>
+    <w:tmpl w:val="C5F0334E"/>
+    <w:lvl w:ilvl="0">
+      <w:start w:val="1"/>
+      <w:numFmt w:val="bullet"/>
+      <w:lvlText w:val=""/>
+      <w:lvlJc w:val="left"/>
+      <w:pPr>
+        <w:tabs>
+          <w:tab w:val="num" w:pos="720"/>
+        </w:tabs>
+        <w:ind w:left="720" w:hanging="360"/>
+      </w:pPr>
+      <w:rPr>
+        <w:rFonts w:ascii="Symbol" w:hAnsi="Symbol" w:hint="default"/>
+        <w:sz w:val="20"/>
+      </w:rPr>
+    </w:lvl>
+    <w:lvl w:ilvl="1" w:tentative="1">
+      <w:start w:val="1"/>
+      <w:numFmt w:val="bullet"/>
+      <w:lvlText w:val="o"/>
+      <w:lvlJc w:val="left"/>
+      <w:pPr>
+        <w:tabs>
+          <w:tab w:val="num" w:pos="1440"/>
+        </w:tabs>
+        <w:ind w:left="1440" w:hanging="360"/>
+      </w:pPr>
+      <w:rPr>
+        <w:rFonts w:ascii="Courier New" w:hAnsi="Courier New" w:hint="default"/>
+        <w:sz w:val="20"/>
+      </w:rPr>
+    </w:lvl>
+    <w:lvl w:ilvl="2" w:tentative="1">
+      <w:start w:val="1"/>
+      <w:numFmt w:val="bullet"/>
+      <w:lvlText w:val=""/>
+      <w:lvlJc w:val="left"/>
+      <w:pPr>
+        <w:tabs>
+          <w:tab w:val="num" w:pos="2160"/>
+        </w:tabs>
+        <w:ind w:left="2160" w:hanging="360"/>
+      </w:pPr>
+      <w:rPr>
+        <w:rFonts w:ascii="Wingdings" w:hAnsi="Wingdings" w:hint="default"/>
+        <w:sz w:val="20"/>
+      </w:rPr>
+    </w:lvl>
+    <w:lvl w:ilvl="3" w:tentative="1">
+      <w:start w:val="1"/>
+      <w:numFmt w:val="bullet"/>
+      <w:lvlText w:val=""/>
+      <w:lvlJc w:val="left"/>
+      <w:pPr>
+        <w:tabs>
+          <w:tab w:val="num" w:pos="2880"/>
+        </w:tabs>
+        <w:ind w:left="2880" w:hanging="360"/>
+      </w:pPr>
+      <w:rPr>
+        <w:rFonts w:ascii="Wingdings" w:hAnsi="Wingdings" w:hint="default"/>
+        <w:sz w:val="20"/>
+      </w:rPr>
+    </w:lvl>
+    <w:lvl w:ilvl="4" w:tentative="1">
+      <w:start w:val="1"/>
+      <w:numFmt w:val="bullet"/>
+      <w:lvlText w:val=""/>
+      <w:lvlJc w:val="left"/>
+      <w:pPr>
+        <w:tabs>
+          <w:tab w:val="num" w:pos="3600"/>
+        </w:tabs>
+        <w:ind w:left="3600" w:hanging="360"/>
+      </w:pPr>
+      <w:rPr>
+        <w:rFonts w:ascii="Wingdings" w:hAnsi="Wingdings" w:hint="default"/>
+        <w:sz w:val="20"/>
+      </w:rPr>
+    </w:lvl>
+    <w:lvl w:ilvl="5" w:tentative="1">
+      <w:start w:val="1"/>
+      <w:numFmt w:val="bullet"/>
+      <w:lvlText w:val=""/>
+      <w:lvlJc w:val="left"/>
+      <w:pPr>
+        <w:tabs>
+          <w:tab w:val="num" w:pos="4320"/>
+        </w:tabs>
+        <w:ind w:left="4320" w:hanging="360"/>
+      </w:pPr>
+      <w:rPr>
+        <w:rFonts w:ascii="Wingdings" w:hAnsi="Wingdings" w:hint="default"/>
+        <w:sz w:val="20"/>
+      </w:rPr>
+    </w:lvl>
+    <w:lvl w:ilvl="6" w:tentative="1">
+      <w:start w:val="1"/>
+      <w:numFmt w:val="bullet"/>
+      <w:lvlText w:val=""/>
+      <w:lvlJc w:val="left"/>
+      <w:pPr>
+        <w:tabs>
+          <w:tab w:val="num" w:pos="5040"/>
+        </w:tabs>
+        <w:ind w:left="5040" w:hanging="360"/>
+      </w:pPr>
+      <w:rPr>
+        <w:rFonts w:ascii="Wingdings" w:hAnsi="Wingdings" w:hint="default"/>
+        <w:sz w:val="20"/>
+      </w:rPr>
+    </w:lvl>
+    <w:lvl w:ilvl="7" w:tentative="1">
+      <w:start w:val="1"/>
+      <w:numFmt w:val="bullet"/>
+      <w:lvlText w:val=""/>
+      <w:lvlJc w:val="left"/>
+      <w:pPr>
+        <w:tabs>
+          <w:tab w:val="num" w:pos="5760"/>
+        </w:tabs>
+        <w:ind w:left="5760" w:hanging="360"/>
+      </w:pPr>
+      <w:rPr>
+        <w:rFonts w:ascii="Wingdings" w:hAnsi="Wingdings" w:hint="default"/>
+        <w:sz w:val="20"/>
+      </w:rPr>
+    </w:lvl>
+    <w:lvl w:ilvl="8" w:tentative="1">
+      <w:start w:val="1"/>
+      <w:numFmt w:val="bullet"/>
+      <w:lvlText w:val=""/>
+      <w:lvlJc w:val="left"/>
+      <w:pPr>
+        <w:tabs>
+          <w:tab w:val="num" w:pos="6480"/>
+        </w:tabs>
+        <w:ind w:left="6480" w:hanging="360"/>
+      </w:pPr>
+      <w:rPr>
+        <w:rFonts w:ascii="Wingdings" w:hAnsi="Wingdings" w:hint="default"/>
+        <w:sz w:val="20"/>
+      </w:rPr>
+    </w:lvl>
+  </w:abstractNum>
+  <w:abstractNum w:abstractNumId="8" w15:restartNumberingAfterBreak="0">
+    <w:nsid w:val="6C594E7F"/>
+    <w:multiLevelType w:val="multilevel"/>
+    <w:tmpl w:val="66DEAD98"/>
+    <w:lvl w:ilvl="0">
+      <w:start w:val="1"/>
+      <w:numFmt w:val="bullet"/>
+      <w:lvlText w:val=""/>
+      <w:lvlJc w:val="left"/>
+      <w:pPr>
+        <w:tabs>
+          <w:tab w:val="num" w:pos="720"/>
+        </w:tabs>
+        <w:ind w:left="720" w:hanging="360"/>
+      </w:pPr>
+      <w:rPr>
+        <w:rFonts w:ascii="Symbol" w:hAnsi="Symbol" w:hint="default"/>
+        <w:sz w:val="20"/>
+      </w:rPr>
+    </w:lvl>
+    <w:lvl w:ilvl="1" w:tentative="1">
+      <w:start w:val="1"/>
+      <w:numFmt w:val="bullet"/>
+      <w:lvlText w:val="o"/>
+      <w:lvlJc w:val="left"/>
+      <w:pPr>
+        <w:tabs>
+          <w:tab w:val="num" w:pos="1440"/>
+        </w:tabs>
+        <w:ind w:left="1440" w:hanging="360"/>
+      </w:pPr>
+      <w:rPr>
+        <w:rFonts w:ascii="Courier New" w:hAnsi="Courier New" w:hint="default"/>
+        <w:sz w:val="20"/>
+      </w:rPr>
+    </w:lvl>
+    <w:lvl w:ilvl="2" w:tentative="1">
+      <w:start w:val="1"/>
+      <w:numFmt w:val="bullet"/>
+      <w:lvlText w:val=""/>
+      <w:lvlJc w:val="left"/>
+      <w:pPr>
+        <w:tabs>
+          <w:tab w:val="num" w:pos="2160"/>
+        </w:tabs>
+        <w:ind w:left="2160" w:hanging="360"/>
+      </w:pPr>
+      <w:rPr>
+        <w:rFonts w:ascii="Wingdings" w:hAnsi="Wingdings" w:hint="default"/>
+        <w:sz w:val="20"/>
+      </w:rPr>
+    </w:lvl>
+    <w:lvl w:ilvl="3" w:tentative="1">
+      <w:start w:val="1"/>
+      <w:numFmt w:val="bullet"/>
+      <w:lvlText w:val=""/>
+      <w:lvlJc w:val="left"/>
+      <w:pPr>
+        <w:tabs>
+          <w:tab w:val="num" w:pos="2880"/>
+        </w:tabs>
+        <w:ind w:left="2880" w:hanging="360"/>
+      </w:pPr>
+      <w:rPr>
+        <w:rFonts w:ascii="Wingdings" w:hAnsi="Wingdings" w:hint="default"/>
+        <w:sz w:val="20"/>
+      </w:rPr>
+    </w:lvl>
+    <w:lvl w:ilvl="4" w:tentative="1">
+      <w:start w:val="1"/>
+      <w:numFmt w:val="bullet"/>
+      <w:lvlText w:val=""/>
+      <w:lvlJc w:val="left"/>
+      <w:pPr>
+        <w:tabs>
+          <w:tab w:val="num" w:pos="3600"/>
+        </w:tabs>
+        <w:ind w:left="3600" w:hanging="360"/>
+      </w:pPr>
+      <w:rPr>
+        <w:rFonts w:ascii="Wingdings" w:hAnsi="Wingdings" w:hint="default"/>
+        <w:sz w:val="20"/>
+      </w:rPr>
+    </w:lvl>
+    <w:lvl w:ilvl="5" w:tentative="1">
+      <w:start w:val="1"/>
+      <w:numFmt w:val="bullet"/>
+      <w:lvlText w:val=""/>
+      <w:lvlJc w:val="left"/>
+      <w:pPr>
+        <w:tabs>
+          <w:tab w:val="num" w:pos="4320"/>
+        </w:tabs>
+        <w:ind w:left="4320" w:hanging="360"/>
+      </w:pPr>
+      <w:rPr>
+        <w:rFonts w:ascii="Wingdings" w:hAnsi="Wingdings" w:hint="default"/>
+        <w:sz w:val="20"/>
+      </w:rPr>
+    </w:lvl>
+    <w:lvl w:ilvl="6" w:tentative="1">
+      <w:start w:val="1"/>
+      <w:numFmt w:val="bullet"/>
+      <w:lvlText w:val=""/>
+      <w:lvlJc w:val="left"/>
+      <w:pPr>
+        <w:tabs>
+          <w:tab w:val="num" w:pos="5040"/>
+        </w:tabs>
+        <w:ind w:left="5040" w:hanging="360"/>
+      </w:pPr>
+      <w:rPr>
+        <w:rFonts w:ascii="Wingdings" w:hAnsi="Wingdings" w:hint="default"/>
+        <w:sz w:val="20"/>
+      </w:rPr>
+    </w:lvl>
+    <w:lvl w:ilvl="7" w:tentative="1">
+      <w:start w:val="1"/>
+      <w:numFmt w:val="bullet"/>
+      <w:lvlText w:val=""/>
+      <w:lvlJc w:val="left"/>
+      <w:pPr>
+        <w:tabs>
+          <w:tab w:val="num" w:pos="5760"/>
+        </w:tabs>
+        <w:ind w:left="5760" w:hanging="360"/>
+      </w:pPr>
+      <w:rPr>
+        <w:rFonts w:ascii="Wingdings" w:hAnsi="Wingdings" w:hint="default"/>
+        <w:sz w:val="20"/>
+      </w:rPr>
+    </w:lvl>
+    <w:lvl w:ilvl="8" w:tentative="1">
+      <w:start w:val="1"/>
+      <w:numFmt w:val="bullet"/>
+      <w:lvlText w:val=""/>
+      <w:lvlJc w:val="left"/>
+      <w:pPr>
+        <w:tabs>
+          <w:tab w:val="num" w:pos="6480"/>
+        </w:tabs>
+        <w:ind w:left="6480" w:hanging="360"/>
+      </w:pPr>
+      <w:rPr>
+        <w:rFonts w:ascii="Wingdings" w:hAnsi="Wingdings" w:hint="default"/>
+        <w:sz w:val="20"/>
+      </w:rPr>
+    </w:lvl>
+  </w:abstractNum>
   <w:num w:numId="1" w16cid:durableId="1472094618">
-    <w:abstractNumId w:val="3"/>
+    <w:abstractNumId w:val="6"/>
   </w:num>
   <w:num w:numId="2" w16cid:durableId="1783261281">
-    <w:abstractNumId w:val="1"/>
+    <w:abstractNumId w:val="4"/>
   </w:num>
   <w:num w:numId="3" w16cid:durableId="867177422">
-    <w:abstractNumId w:val="2"/>
+    <w:abstractNumId w:val="5"/>
   </w:num>
   <w:num w:numId="4" w16cid:durableId="811366486">
     <w:abstractNumId w:val="0"/>
+  </w:num>
+  <w:num w:numId="5" w16cid:durableId="592395839">
+    <w:abstractNumId w:val="2"/>
+  </w:num>
+  <w:num w:numId="6" w16cid:durableId="1640652553">
+    <w:abstractNumId w:val="1"/>
+  </w:num>
+  <w:num w:numId="7" w16cid:durableId="112330540">
+    <w:abstractNumId w:val="8"/>
+  </w:num>
+  <w:num w:numId="8" w16cid:durableId="1318192429">
+    <w:abstractNumId w:val="7"/>
+  </w:num>
+  <w:num w:numId="9" w16cid:durableId="1322464844">
+    <w:abstractNumId w:val="3"/>
   </w:num>
 </w:numbering>
 </file>
@@ -6964,6 +7504,21 @@
 </file>
 
 <file path=customXml/item1.xml><?xml version="1.0" encoding="utf-8"?>
+<p:properties xmlns:p="http://schemas.microsoft.com/office/2006/metadata/properties" xmlns:xsi="http://www.w3.org/2001/XMLSchema-instance" xmlns:pc="http://schemas.microsoft.com/office/infopath/2007/PartnerControls">
+  <documentManagement/>
+</p:properties>
+</file>
+
+<file path=customXml/item2.xml><?xml version="1.0" encoding="utf-8"?>
+<?mso-contentType ?>
+<FormTemplates xmlns="http://schemas.microsoft.com/sharepoint/v3/contenttype/forms">
+  <Display>DocumentLibraryForm</Display>
+  <Edit>DocumentLibraryForm</Edit>
+  <New>DocumentLibraryForm</New>
+</FormTemplates>
+</file>
+
+<file path=customXml/item3.xml><?xml version="1.0" encoding="utf-8"?>
 <ct:contentTypeSchema xmlns:ct="http://schemas.microsoft.com/office/2006/metadata/contentType" xmlns:ma="http://schemas.microsoft.com/office/2006/metadata/properties/metaAttributes" ct:_="" ma:_="" ma:contentTypeName="Document" ma:contentTypeID="0x010100BF172252CC1C53449338812EA1037233" ma:contentTypeVersion="4" ma:contentTypeDescription="Create a new document." ma:contentTypeScope="" ma:versionID="19cf7ed37a14517615dffa0af7ae0657">
   <xsd:schema xmlns:xsd="http://www.w3.org/2001/XMLSchema" xmlns:xs="http://www.w3.org/2001/XMLSchema" xmlns:p="http://schemas.microsoft.com/office/2006/metadata/properties" xmlns:ns3="c4716d38-bf25-4bcd-9478-3a7eb44f1881" targetNamespace="http://schemas.microsoft.com/office/2006/metadata/properties" ma:root="true" ma:fieldsID="3cf0a78e66cb48c586d9b2154a08e24c" ns3:_="">
     <xsd:import namespace="c4716d38-bf25-4bcd-9478-3a7eb44f1881"/>
@@ -7107,22 +7662,24 @@
 </ct:contentTypeSchema>
 </file>
 
-<file path=customXml/item2.xml><?xml version="1.0" encoding="utf-8"?>
-<?mso-contentType ?>
-<FormTemplates xmlns="http://schemas.microsoft.com/sharepoint/v3/contenttype/forms">
-  <Display>DocumentLibraryForm</Display>
-  <Edit>DocumentLibraryForm</Edit>
-  <New>DocumentLibraryForm</New>
-</FormTemplates>
+<file path=customXml/itemProps1.xml><?xml version="1.0" encoding="utf-8"?>
+<ds:datastoreItem xmlns:ds="http://schemas.openxmlformats.org/officeDocument/2006/customXml" ds:itemID="{935CD2EF-4A2D-48F5-BFC3-D151D89F2011}">
+  <ds:schemaRefs>
+    <ds:schemaRef ds:uri="http://schemas.microsoft.com/office/2006/metadata/properties"/>
+    <ds:schemaRef ds:uri="http://schemas.microsoft.com/office/infopath/2007/PartnerControls"/>
+  </ds:schemaRefs>
+</ds:datastoreItem>
 </file>
 
-<file path=customXml/item3.xml><?xml version="1.0" encoding="utf-8"?>
-<p:properties xmlns:p="http://schemas.microsoft.com/office/2006/metadata/properties" xmlns:xsi="http://www.w3.org/2001/XMLSchema-instance" xmlns:pc="http://schemas.microsoft.com/office/infopath/2007/PartnerControls">
-  <documentManagement/>
-</p:properties>
+<file path=customXml/itemProps2.xml><?xml version="1.0" encoding="utf-8"?>
+<ds:datastoreItem xmlns:ds="http://schemas.openxmlformats.org/officeDocument/2006/customXml" ds:itemID="{9A1493F5-3B41-4FD5-B863-2C6A7E76375B}">
+  <ds:schemaRefs>
+    <ds:schemaRef ds:uri="http://schemas.microsoft.com/sharepoint/v3/contenttype/forms"/>
+  </ds:schemaRefs>
+</ds:datastoreItem>
 </file>
 
-<file path=customXml/itemProps1.xml><?xml version="1.0" encoding="utf-8"?>
+<file path=customXml/itemProps3.xml><?xml version="1.0" encoding="utf-8"?>
 <ds:datastoreItem xmlns:ds="http://schemas.openxmlformats.org/officeDocument/2006/customXml" ds:itemID="{D1D5086A-592E-46A4-B551-F7D069735410}">
   <ds:schemaRefs>
     <ds:schemaRef ds:uri="http://schemas.microsoft.com/office/2006/metadata/contentType"/>
@@ -7138,21 +7695,4 @@
     <ds:schemaRef ds:uri="http://schemas.microsoft.com/internal/obd"/>
   </ds:schemaRefs>
 </ds:datastoreItem>
-</file>
-
-<file path=customXml/itemProps2.xml><?xml version="1.0" encoding="utf-8"?>
-<ds:datastoreItem xmlns:ds="http://schemas.openxmlformats.org/officeDocument/2006/customXml" ds:itemID="{9A1493F5-3B41-4FD5-B863-2C6A7E76375B}">
-  <ds:schemaRefs>
-    <ds:schemaRef ds:uri="http://schemas.microsoft.com/sharepoint/v3/contenttype/forms"/>
-  </ds:schemaRefs>
-</ds:datastoreItem>
-</file>
-
-<file path=customXml/itemProps3.xml><?xml version="1.0" encoding="utf-8"?>
-<ds:datastoreItem xmlns:ds="http://schemas.openxmlformats.org/officeDocument/2006/customXml" ds:itemID="{935CD2EF-4A2D-48F5-BFC3-D151D89F2011}">
-  <ds:schemaRefs>
-    <ds:schemaRef ds:uri="http://schemas.microsoft.com/office/2006/metadata/properties"/>
-    <ds:schemaRef ds:uri="http://schemas.microsoft.com/office/infopath/2007/PartnerControls"/>
-  </ds:schemaRefs>
-</ds:datastoreItem>
 </file>
</xml_diff>